<commit_message>
Update product docs: F23 sign-in, "Сегодня для тебя" practices, nav copy
Replaces Acceptance Criteria, App Structure, Course Content, Feature
List and Functional Requirements with newer versions covering the
Sign in with Apple onboarding step and the new short-practice block
on the home screen.

Co-Authored-By: Claude Sonnet 5 <noreply@anthropic.com>
Claude-Session: https://claude.ai/code/session_01585njnqsWwzCe2Hr4ArF6P
</commit_message>
<xml_diff>
--- a/docs/product/Lumi_Acceptance_Criteria.docx
+++ b/docs/product/Lumi_Acceptance_Criteria.docx
@@ -226,6 +226,75 @@
     </w:p>
     <w:p>
       <w:pPr>
+        <w:spacing w:after="70" w:line="268"/>
+        <w:ind w:left="260"/>
+      </w:pPr>
+      <w:r>
+        <w:rPr>
+          <w:b/>
+          <w:bCs/>
+          <w:color w:val="2E7D32"/>
+          <w:sz w:val="21"/>
+          <w:szCs w:val="21"/>
+        </w:rPr>
+        <w:t xml:space="preserve">☐ </w:t>
+      </w:r>
+      <w:r>
+        <w:rPr>
+          <w:sz w:val="21"/>
+          <w:szCs w:val="21"/>
+        </w:rPr>
+        <w:t xml:space="preserve">При ответе на Q1 ≤ 2 старт всегда происходит с курса 0, независимо от ответа на Q2.</w:t>
+      </w:r>
+    </w:p>
+    <w:p>
+      <w:pPr>
+        <w:spacing w:after="70" w:line="268"/>
+        <w:ind w:left="260"/>
+      </w:pPr>
+      <w:r>
+        <w:rPr>
+          <w:b/>
+          <w:bCs/>
+          <w:color w:val="2E7D32"/>
+          <w:sz w:val="21"/>
+          <w:szCs w:val="21"/>
+        </w:rPr>
+        <w:t xml:space="preserve">☐ </w:t>
+      </w:r>
+      <w:r>
+        <w:rPr>
+          <w:sz w:val="21"/>
+          <w:szCs w:val="21"/>
+        </w:rPr>
+        <w:t xml:space="preserve">Экран регистрации (Sign in with Apple) невозможно пропустить — без аккаунта дальнейшее прохождение блокируется.</w:t>
+      </w:r>
+    </w:p>
+    <w:p>
+      <w:pPr>
+        <w:spacing w:after="70" w:line="268"/>
+        <w:ind w:left="260"/>
+      </w:pPr>
+      <w:r>
+        <w:rPr>
+          <w:b/>
+          <w:bCs/>
+          <w:color w:val="2E7D32"/>
+          <w:sz w:val="21"/>
+          <w:szCs w:val="21"/>
+        </w:rPr>
+        <w:t xml:space="preserve">☐ </w:t>
+      </w:r>
+      <w:r>
+        <w:rPr>
+          <w:sz w:val="21"/>
+          <w:szCs w:val="21"/>
+        </w:rPr>
+        <w:t xml:space="preserve">Прогресс, XP и люмены корректно сохраняются и восстанавливаются при повторном входе через тот же Apple ID.</w:t>
+      </w:r>
+    </w:p>
+    <w:p>
+      <w:pPr>
         <w:pStyle w:val="Heading1"/>
         <w:pBdr>
           <w:bottom w:val="single" w:color="5B4B9E" w:sz="8" w:space="4"/>
@@ -240,7 +309,7 @@
           <w:sz w:val="30"/>
           <w:szCs w:val="30"/>
         </w:rPr>
-        <w:t xml:space="preserve">Навигация и контент (F5–F10)</w:t>
+        <w:t xml:space="preserve">Навигация и контент (F5–F10, F20–F22)</w:t>
       </w:r>
     </w:p>
     <w:p>
@@ -402,6 +471,121 @@
           <w:szCs w:val="21"/>
         </w:rPr>
         <w:t xml:space="preserve">Главный экран «Луми» корректно отображает состояние маскота, соответствующее актуальному прогрессу пользователя на момент открытия экрана.</w:t>
+      </w:r>
+    </w:p>
+    <w:p>
+      <w:pPr>
+        <w:spacing w:after="70" w:line="268"/>
+        <w:ind w:left="260"/>
+      </w:pPr>
+      <w:r>
+        <w:rPr>
+          <w:b/>
+          <w:bCs/>
+          <w:color w:val="2E7D32"/>
+          <w:sz w:val="21"/>
+          <w:szCs w:val="21"/>
+        </w:rPr>
+        <w:t xml:space="preserve">☐ </w:t>
+      </w:r>
+      <w:r>
+        <w:rPr>
+          <w:sz w:val="21"/>
+          <w:szCs w:val="21"/>
+        </w:rPr>
+        <w:t xml:space="preserve">Приветствие на главном экране корректно подставляет имя пользователя из данных онбординга/профиля.</w:t>
+      </w:r>
+    </w:p>
+    <w:p>
+      <w:pPr>
+        <w:spacing w:after="70" w:line="268"/>
+        <w:ind w:left="260"/>
+      </w:pPr>
+      <w:r>
+        <w:rPr>
+          <w:b/>
+          <w:bCs/>
+          <w:color w:val="2E7D32"/>
+          <w:sz w:val="21"/>
+          <w:szCs w:val="21"/>
+        </w:rPr>
+        <w:t xml:space="preserve">☐ </w:t>
+      </w:r>
+      <w:r>
+        <w:rPr>
+          <w:sz w:val="21"/>
+          <w:szCs w:val="21"/>
+        </w:rPr>
+        <w:t xml:space="preserve">Плитки блока «Сегодня для тебя» открывают именно то содержание, которое утвердил психолог — не placeholder-текст.</w:t>
+      </w:r>
+    </w:p>
+    <w:p>
+      <w:pPr>
+        <w:spacing w:after="70" w:line="268"/>
+        <w:ind w:left="260"/>
+      </w:pPr>
+      <w:r>
+        <w:rPr>
+          <w:b/>
+          <w:bCs/>
+          <w:color w:val="2E7D32"/>
+          <w:sz w:val="21"/>
+          <w:szCs w:val="21"/>
+        </w:rPr>
+        <w:t xml:space="preserve">☐ </w:t>
+      </w:r>
+      <w:r>
+        <w:rPr>
+          <w:sz w:val="21"/>
+          <w:szCs w:val="21"/>
+        </w:rPr>
+        <w:t xml:space="preserve">Прохождение короткой практики (F20) не засчитывается как прохождение урока курса и не влияет на прогресс курса.</w:t>
+      </w:r>
+    </w:p>
+    <w:p>
+      <w:pPr>
+        <w:spacing w:after="70" w:line="268"/>
+        <w:ind w:left="260"/>
+      </w:pPr>
+      <w:r>
+        <w:rPr>
+          <w:b/>
+          <w:bCs/>
+          <w:color w:val="2E7D32"/>
+          <w:sz w:val="21"/>
+          <w:szCs w:val="21"/>
+        </w:rPr>
+        <w:t xml:space="preserve">☐ </w:t>
+      </w:r>
+      <w:r>
+        <w:rPr>
+          <w:sz w:val="21"/>
+          <w:szCs w:val="21"/>
+        </w:rPr>
+        <w:t xml:space="preserve">Карточка «Мысль дня» не показывает одну и ту же фразу чаще раза в 2 недели при ежедневном открытии приложения.</w:t>
+      </w:r>
+    </w:p>
+    <w:p>
+      <w:pPr>
+        <w:spacing w:after="70" w:line="268"/>
+        <w:ind w:left="260"/>
+      </w:pPr>
+      <w:r>
+        <w:rPr>
+          <w:b/>
+          <w:bCs/>
+          <w:color w:val="2E7D32"/>
+          <w:sz w:val="21"/>
+          <w:szCs w:val="21"/>
+        </w:rPr>
+        <w:t xml:space="preserve">☐ </w:t>
+      </w:r>
+      <w:r>
+        <w:rPr>
+          <w:sz w:val="21"/>
+          <w:szCs w:val="21"/>
+        </w:rPr>
+        <w:t xml:space="preserve">Кнопка «Гардероб →» на главном экране (F22) ведёт в тот же магазин, что и доступ через профиль (F13), без дублирования логики или несовпадения баланса.</w:t>
       </w:r>
     </w:p>
     <w:p>
@@ -563,6 +747,52 @@
     </w:p>
     <w:p>
       <w:pPr>
+        <w:spacing w:after="70" w:line="268"/>
+        <w:ind w:left="260"/>
+      </w:pPr>
+      <w:r>
+        <w:rPr>
+          <w:b/>
+          <w:bCs/>
+          <w:color w:val="2E7D32"/>
+          <w:sz w:val="21"/>
+          <w:szCs w:val="21"/>
+        </w:rPr>
+        <w:t xml:space="preserve">☐ </w:t>
+      </w:r>
+      <w:r>
+        <w:rPr>
+          <w:sz w:val="21"/>
+          <w:szCs w:val="21"/>
+        </w:rPr>
+        <w:t xml:space="preserve">Товары выше доступного по текущему уровню пользователя не покупаются — кнопка неактивна с подсказкой об уровне открытия.</w:t>
+      </w:r>
+    </w:p>
+    <w:p>
+      <w:pPr>
+        <w:spacing w:after="70" w:line="268"/>
+        <w:ind w:left="260"/>
+      </w:pPr>
+      <w:r>
+        <w:rPr>
+          <w:b/>
+          <w:bCs/>
+          <w:color w:val="2E7D32"/>
+          <w:sz w:val="21"/>
+          <w:szCs w:val="21"/>
+        </w:rPr>
+        <w:t xml:space="preserve">☐ </w:t>
+      </w:r>
+      <w:r>
+        <w:rPr>
+          <w:sz w:val="21"/>
+          <w:szCs w:val="21"/>
+        </w:rPr>
+        <w:t xml:space="preserve">При достижении уровня 2 и 3 соответствующие категории редкости (редкие/эпические) становятся доступны немедленно, без перезапуска приложения.</w:t>
+      </w:r>
+    </w:p>
+    <w:p>
+      <w:pPr>
         <w:pStyle w:val="Heading1"/>
         <w:pBdr>
           <w:bottom w:val="single" w:color="5B4B9E" w:sz="8" w:space="4"/>
@@ -938,6 +1168,117 @@
           <w:szCs w:val="21"/>
         </w:rPr>
         <w:t xml:space="preserve">Список кризисных паттернов-триггеров (F19) утверждён психологом отдельно и не публикуется в открытых продуктовых документах.</w:t>
+      </w:r>
+    </w:p>
+    <w:p>
+      <w:pPr>
+        <w:pStyle w:val="Heading1"/>
+        <w:pBdr>
+          <w:bottom w:val="single" w:color="5B4B9E" w:sz="8" w:space="4"/>
+        </w:pBdr>
+        <w:spacing w:after="150" w:before="380"/>
+      </w:pPr>
+      <w:r>
+        <w:rPr>
+          <w:b/>
+          <w:bCs/>
+          <w:color w:val="5B4B9E"/>
+          <w:sz w:val="30"/>
+          <w:szCs w:val="30"/>
+        </w:rPr>
+        <w:t xml:space="preserve">Виджет (F24)</w:t>
+      </w:r>
+    </w:p>
+    <w:p>
+      <w:pPr>
+        <w:spacing w:after="70" w:line="268"/>
+        <w:ind w:left="260"/>
+      </w:pPr>
+      <w:r>
+        <w:rPr>
+          <w:b/>
+          <w:bCs/>
+          <w:color w:val="2E7D32"/>
+          <w:sz w:val="21"/>
+          <w:szCs w:val="21"/>
+        </w:rPr>
+        <w:t xml:space="preserve">☐ </w:t>
+      </w:r>
+      <w:r>
+        <w:rPr>
+          <w:sz w:val="21"/>
+          <w:szCs w:val="21"/>
+        </w:rPr>
+        <w:t xml:space="preserve">Виджет корректно отображается в размерах small и medium на домашнем экране iOS.</w:t>
+      </w:r>
+    </w:p>
+    <w:p>
+      <w:pPr>
+        <w:spacing w:after="70" w:line="268"/>
+        <w:ind w:left="260"/>
+      </w:pPr>
+      <w:r>
+        <w:rPr>
+          <w:b/>
+          <w:bCs/>
+          <w:color w:val="2E7D32"/>
+          <w:sz w:val="21"/>
+          <w:szCs w:val="21"/>
+        </w:rPr>
+        <w:t xml:space="preserve">☐ </w:t>
+      </w:r>
+      <w:r>
+        <w:rPr>
+          <w:sz w:val="21"/>
+          <w:szCs w:val="21"/>
+        </w:rPr>
+        <w:t xml:space="preserve">Серия дней в виджете совпадает со значением в приложении на момент последнего обновления timeline.</w:t>
+      </w:r>
+    </w:p>
+    <w:p>
+      <w:pPr>
+        <w:spacing w:after="70" w:line="268"/>
+        <w:ind w:left="260"/>
+      </w:pPr>
+      <w:r>
+        <w:rPr>
+          <w:b/>
+          <w:bCs/>
+          <w:color w:val="2E7D32"/>
+          <w:sz w:val="21"/>
+          <w:szCs w:val="21"/>
+        </w:rPr>
+        <w:t xml:space="preserve">☐ </w:t>
+      </w:r>
+      <w:r>
+        <w:rPr>
+          <w:sz w:val="21"/>
+          <w:szCs w:val="21"/>
+        </w:rPr>
+        <w:t xml:space="preserve">Мысль дня в виджете не показывает placeholder или пустое состояние после установки — подтягивает актуальную фразу при первом добавлении.</w:t>
+      </w:r>
+    </w:p>
+    <w:p>
+      <w:pPr>
+        <w:spacing w:after="70" w:line="268"/>
+        <w:ind w:left="260"/>
+      </w:pPr>
+      <w:r>
+        <w:rPr>
+          <w:b/>
+          <w:bCs/>
+          <w:color w:val="2E7D32"/>
+          <w:sz w:val="21"/>
+          <w:szCs w:val="21"/>
+        </w:rPr>
+        <w:t xml:space="preserve">☐ </w:t>
+      </w:r>
+      <w:r>
+        <w:rPr>
+          <w:sz w:val="21"/>
+          <w:szCs w:val="21"/>
+        </w:rPr>
+        <w:t xml:space="preserve">Обновление данных в виджете происходит без необходимости открывать приложение.</w:t>
       </w:r>
     </w:p>
     <w:p>

</xml_diff>